<commit_message>
Update CV open defaults
</commit_message>
<xml_diff>
--- a/docs/潘泽伦_简历.docx
+++ b/docs/潘泽伦_简历.docx
@@ -24,7 +24,7 @@
           <w:lang w:eastAsia="zh-CN"/>
         </w:rPr>
         <w:drawing>
-          <wp:anchor distT="0" distB="0" distL="114300" distR="114300" simplePos="0" relativeHeight="251670528" behindDoc="0" locked="0" layoutInCell="1" allowOverlap="1" wp14:anchorId="6B0E0460" wp14:editId="07AF7EE8">
+          <wp:anchor distT="0" distB="0" distL="114300" distR="114300" simplePos="0" relativeHeight="251670528" behindDoc="0" locked="0" layoutInCell="1" allowOverlap="1" wp14:anchorId="6B0E0460" wp14:editId="12FA0403">
             <wp:simplePos x="0" y="0"/>
             <wp:positionH relativeFrom="margin">
               <wp:align>left</wp:align>
@@ -495,7 +495,7 @@
         <w:spacing w:before="20" w:line="300" w:lineRule="exact"/>
         <w:ind w:left="2583" w:firstLine="297"/>
         <w:rPr>
-          <w:rFonts w:ascii="Times New Roman" w:eastAsia="楷体" w:hAnsi="Times New Roman" w:cs="Times New Roman" w:hint="eastAsia"/>
+          <w:rFonts w:ascii="Times New Roman" w:eastAsia="楷体" w:hAnsi="Times New Roman" w:cs="Times New Roman"/>
           <w:sz w:val="21"/>
           <w:szCs w:val="21"/>
           <w:lang w:eastAsia="zh-CN"/>
@@ -1578,7 +1578,7 @@
         </w:tabs>
         <w:spacing w:before="0" w:after="100" w:line="300" w:lineRule="exact"/>
         <w:rPr>
-          <w:rFonts w:ascii="Times New Roman" w:eastAsia="楷体" w:hAnsi="Times New Roman" w:cs="Times New Roman" w:hint="eastAsia"/>
+          <w:rFonts w:ascii="Times New Roman" w:eastAsia="楷体" w:hAnsi="Times New Roman" w:cs="Times New Roman"/>
           <w:lang w:eastAsia="zh-CN"/>
         </w:rPr>
       </w:pPr>
@@ -1689,7 +1689,7 @@
         <w:ind w:left="528"/>
         <w:jc w:val="both"/>
         <w:rPr>
-          <w:rFonts w:ascii="Times New Roman" w:eastAsia="楷体" w:hAnsi="Times New Roman" w:cs="Times New Roman" w:hint="eastAsia"/>
+          <w:rFonts w:ascii="Times New Roman" w:eastAsia="楷体" w:hAnsi="Times New Roman" w:cs="Times New Roman"/>
           <w:sz w:val="20"/>
           <w:szCs w:val="21"/>
           <w:lang w:eastAsia="zh-CN"/>
@@ -2298,7 +2298,7 @@
         <w:ind w:left="528"/>
         <w:jc w:val="both"/>
         <w:rPr>
-          <w:rFonts w:ascii="Times New Roman" w:eastAsia="楷体" w:hAnsi="Times New Roman" w:cs="Times New Roman" w:hint="eastAsia"/>
+          <w:rFonts w:ascii="Times New Roman" w:eastAsia="楷体" w:hAnsi="Times New Roman" w:cs="Times New Roman"/>
           <w:lang w:eastAsia="zh-CN"/>
         </w:rPr>
       </w:pPr>
@@ -2733,7 +2733,7 @@
         <w:ind w:firstLineChars="64" w:firstLine="141"/>
         <w:jc w:val="both"/>
         <w:rPr>
-          <w:rFonts w:ascii="Times New Roman" w:eastAsia="楷体" w:hAnsi="Times New Roman" w:cs="Times New Roman" w:hint="eastAsia"/>
+          <w:rFonts w:ascii="Times New Roman" w:eastAsia="楷体" w:hAnsi="Times New Roman" w:cs="Times New Roman"/>
           <w:lang w:eastAsia="zh-CN"/>
         </w:rPr>
       </w:pPr>
@@ -3389,7 +3389,7 @@
         <w:ind w:left="528"/>
         <w:jc w:val="both"/>
         <w:rPr>
-          <w:rFonts w:ascii="Times New Roman" w:eastAsia="楷体" w:hAnsi="Times New Roman" w:cs="Times New Roman" w:hint="eastAsia"/>
+          <w:rFonts w:ascii="Times New Roman" w:eastAsia="楷体" w:hAnsi="Times New Roman" w:cs="Times New Roman"/>
           <w:sz w:val="20"/>
           <w:lang w:eastAsia="zh-CN"/>
         </w:rPr>
@@ -3495,16 +3495,27 @@
           <w:u w:val="single"/>
           <w:lang w:eastAsia="zh-CN"/>
         </w:rPr>
-        <w:t>项目经历</w:t>
-      </w:r>
-      <w:r>
-        <w:rPr>
-          <w:rFonts w:ascii="Times New Roman" w:eastAsia="楷体" w:hAnsi="Times New Roman" w:cs="Times New Roman"/>
+        <w:t>比赛</w:t>
+      </w:r>
+      <w:r>
+        <w:rPr>
+          <w:rFonts w:ascii="Times New Roman" w:eastAsia="楷体" w:hAnsi="Times New Roman" w:cs="Times New Roman" w:hint="eastAsia"/>
+          <w:position w:val="4"/>
           <w:sz w:val="24"/>
           <w:szCs w:val="24"/>
           <w:u w:val="single"/>
           <w:lang w:eastAsia="zh-CN"/>
         </w:rPr>
+        <w:t>经历</w:t>
+      </w:r>
+      <w:r>
+        <w:rPr>
+          <w:rFonts w:ascii="Times New Roman" w:eastAsia="楷体" w:hAnsi="Times New Roman" w:cs="Times New Roman"/>
+          <w:sz w:val="24"/>
+          <w:szCs w:val="24"/>
+          <w:u w:val="single"/>
+          <w:lang w:eastAsia="zh-CN"/>
+        </w:rPr>
         <w:t xml:space="preserve">           </w:t>
       </w:r>
       <w:r>
@@ -3543,20 +3554,20 @@
         <w:ind w:firstLine="108"/>
         <w:jc w:val="both"/>
         <w:rPr>
-          <w:rFonts w:ascii="Times New Roman" w:eastAsia="楷体" w:hAnsi="Times New Roman" w:cs="Times New Roman"/>
+          <w:rFonts w:ascii="Times New Roman" w:eastAsia="楷体" w:hAnsi="Times New Roman" w:cs="Times New Roman" w:hint="eastAsia"/>
           <w:color w:val="000000" w:themeColor="text1"/>
           <w:lang w:eastAsia="zh-CN"/>
         </w:rPr>
       </w:pPr>
       <w:r>
         <w:rPr>
-          <w:rFonts w:ascii="Times New Roman" w:eastAsia="楷体" w:hAnsi="Times New Roman" w:cs="Times New Roman"/>
+          <w:rFonts w:ascii="Times New Roman" w:eastAsia="楷体" w:hAnsi="Times New Roman" w:cs="Times New Roman" w:hint="eastAsia"/>
           <w:b/>
           <w:bCs/>
           <w:color w:val="000000" w:themeColor="text1"/>
           <w:lang w:eastAsia="zh-CN"/>
         </w:rPr>
-        <w:t>基于</w:t>
+        <w:t>2026</w:t>
       </w:r>
       <w:r>
         <w:rPr>
@@ -3566,7 +3577,7 @@
           <w:color w:val="000000" w:themeColor="text1"/>
           <w:lang w:eastAsia="zh-CN"/>
         </w:rPr>
-        <w:t>阻性存储器的高能效智能芯片项目</w:t>
+        <w:t>年</w:t>
       </w:r>
       <w:r>
         <w:rPr>
@@ -3576,7 +3587,7 @@
           <w:color w:val="000000" w:themeColor="text1"/>
           <w:lang w:eastAsia="zh-CN"/>
         </w:rPr>
-        <w:t xml:space="preserve"> </w:t>
+        <w:t>“</w:t>
       </w:r>
       <w:r>
         <w:rPr>
@@ -3586,17 +3597,17 @@
           <w:color w:val="000000" w:themeColor="text1"/>
           <w:lang w:eastAsia="zh-CN"/>
         </w:rPr>
-        <w:t>（核心项目成员）</w:t>
-      </w:r>
-      <w:r>
-        <w:rPr>
-          <w:rFonts w:ascii="Times New Roman" w:eastAsia="楷体" w:hAnsi="Times New Roman" w:cs="Times New Roman" w:hint="eastAsia"/>
+        <w:t>华为杯”</w:t>
+      </w:r>
+      <w:r>
+        <w:rPr>
+          <w:rFonts w:ascii="Times New Roman" w:eastAsia="楷体" w:hAnsi="Times New Roman" w:cs="Times New Roman"/>
           <w:b/>
           <w:bCs/>
           <w:color w:val="000000" w:themeColor="text1"/>
           <w:lang w:eastAsia="zh-CN"/>
         </w:rPr>
-        <w:t xml:space="preserve">                            </w:t>
+        <w:t>中国研究生创</w:t>
       </w:r>
       <w:r>
         <w:rPr>
@@ -3606,70 +3617,124 @@
           <w:color w:val="000000" w:themeColor="text1"/>
           <w:lang w:eastAsia="zh-CN"/>
         </w:rPr>
+        <w:t>“</w:t>
+      </w:r>
+      <w:r>
+        <w:rPr>
+          <w:rFonts w:ascii="Times New Roman" w:eastAsia="楷体" w:hAnsi="Times New Roman" w:cs="Times New Roman"/>
+          <w:b/>
+          <w:bCs/>
+          <w:color w:val="000000" w:themeColor="text1"/>
+          <w:lang w:eastAsia="zh-CN"/>
+        </w:rPr>
+        <w:t>芯</w:t>
+      </w:r>
+      <w:r>
+        <w:rPr>
+          <w:rFonts w:ascii="Times New Roman" w:eastAsia="楷体" w:hAnsi="Times New Roman" w:cs="Times New Roman"/>
+          <w:b/>
+          <w:bCs/>
+          <w:color w:val="000000" w:themeColor="text1"/>
+          <w:lang w:eastAsia="zh-CN"/>
+        </w:rPr>
+        <w:t>”</w:t>
+      </w:r>
+      <w:r>
+        <w:rPr>
+          <w:rFonts w:ascii="Times New Roman" w:eastAsia="楷体" w:hAnsi="Times New Roman" w:cs="Times New Roman"/>
+          <w:b/>
+          <w:bCs/>
+          <w:color w:val="000000" w:themeColor="text1"/>
+          <w:lang w:eastAsia="zh-CN"/>
+        </w:rPr>
+        <w:t>大赛</w:t>
+      </w:r>
+      <w:r>
+        <w:rPr>
+          <w:rFonts w:ascii="Times New Roman" w:eastAsia="楷体" w:hAnsi="Times New Roman" w:cs="Times New Roman" w:hint="eastAsia"/>
+          <w:b/>
+          <w:bCs/>
+          <w:color w:val="000000" w:themeColor="text1"/>
+          <w:lang w:eastAsia="zh-CN"/>
+        </w:rPr>
+        <w:t xml:space="preserve">                           </w:t>
+      </w:r>
+      <w:r>
+        <w:rPr>
+          <w:rFonts w:ascii="Times New Roman" w:eastAsia="楷体" w:hAnsi="Times New Roman" w:cs="Times New Roman"/>
+          <w:b/>
+          <w:bCs/>
+          <w:color w:val="000000" w:themeColor="text1"/>
+          <w:lang w:eastAsia="zh-CN"/>
+        </w:rPr>
         <w:t xml:space="preserve">                </w:t>
       </w:r>
       <w:r>
         <w:rPr>
           <w:rFonts w:ascii="Times New Roman" w:eastAsia="楷体" w:hAnsi="Times New Roman" w:cs="Times New Roman"/>
+          <w:b/>
           <w:bCs/>
           <w:color w:val="000000" w:themeColor="text1"/>
           <w:lang w:eastAsia="zh-CN"/>
         </w:rPr>
-        <w:t>202</w:t>
-      </w:r>
-      <w:r>
-        <w:rPr>
-          <w:rFonts w:ascii="Times New Roman" w:eastAsia="楷体" w:hAnsi="Times New Roman" w:cs="Times New Roman" w:hint="eastAsia"/>
+        <w:tab/>
+      </w:r>
+      <w:r>
+        <w:rPr>
+          <w:rFonts w:ascii="Times New Roman" w:eastAsia="楷体" w:hAnsi="Times New Roman" w:cs="Times New Roman"/>
+          <w:b/>
           <w:bCs/>
           <w:color w:val="000000" w:themeColor="text1"/>
           <w:lang w:eastAsia="zh-CN"/>
         </w:rPr>
-        <w:t>1.</w:t>
-      </w:r>
-      <w:r>
-        <w:rPr>
-          <w:rFonts w:ascii="Times New Roman" w:eastAsia="楷体" w:hAnsi="Times New Roman" w:cs="Times New Roman" w:hint="eastAsia"/>
+        <w:tab/>
+      </w:r>
+      <w:r>
+        <w:rPr>
+          <w:rFonts w:ascii="Times New Roman" w:eastAsia="楷体" w:hAnsi="Times New Roman" w:cs="Times New Roman"/>
+          <w:b/>
           <w:bCs/>
           <w:color w:val="000000" w:themeColor="text1"/>
           <w:lang w:eastAsia="zh-CN"/>
         </w:rPr>
-        <w:t>11</w:t>
-      </w:r>
-      <w:r>
-        <w:rPr>
-          <w:rFonts w:ascii="Times New Roman" w:eastAsia="楷体" w:hAnsi="Times New Roman" w:cs="Times New Roman"/>
+        <w:tab/>
+      </w:r>
+      <w:r>
+        <w:rPr>
+          <w:rFonts w:ascii="Times New Roman" w:eastAsia="楷体" w:hAnsi="Times New Roman" w:cs="Times New Roman"/>
+          <w:b/>
           <w:bCs/>
           <w:color w:val="000000" w:themeColor="text1"/>
           <w:lang w:eastAsia="zh-CN"/>
         </w:rPr>
-        <w:t>~202</w:t>
-      </w:r>
-      <w:r>
-        <w:rPr>
-          <w:rFonts w:ascii="Times New Roman" w:eastAsia="楷体" w:hAnsi="Times New Roman" w:cs="Times New Roman" w:hint="eastAsia"/>
-          <w:bCs/>
+        <w:tab/>
+      </w:r>
+      <w:r>
+        <w:rPr>
+          <w:rFonts w:ascii="Times New Roman" w:eastAsia="楷体" w:hAnsi="Times New Roman" w:cs="Times New Roman" w:hint="eastAsia"/>
+          <w:b/>
           <w:color w:val="000000" w:themeColor="text1"/>
           <w:lang w:eastAsia="zh-CN"/>
         </w:rPr>
-        <w:t>4</w:t>
-      </w:r>
-      <w:r>
-        <w:rPr>
-          <w:rFonts w:ascii="Times New Roman" w:eastAsia="楷体" w:hAnsi="Times New Roman" w:cs="Times New Roman" w:hint="eastAsia"/>
-          <w:bCs/>
+        <w:t>2026.06</w:t>
+      </w:r>
+      <w:r>
+        <w:rPr>
+          <w:rFonts w:ascii="Times New Roman" w:eastAsia="楷体" w:hAnsi="Times New Roman" w:cs="Times New Roman" w:hint="eastAsia"/>
+          <w:b/>
           <w:color w:val="000000" w:themeColor="text1"/>
           <w:lang w:eastAsia="zh-CN"/>
         </w:rPr>
-        <w:t>.</w:t>
-      </w:r>
-      <w:r>
-        <w:rPr>
-          <w:rFonts w:ascii="Times New Roman" w:eastAsia="楷体" w:hAnsi="Times New Roman" w:cs="Times New Roman" w:hint="eastAsia"/>
-          <w:bCs/>
+        <w:t>~</w:t>
+      </w:r>
+      <w:r>
+        <w:rPr>
+          <w:rFonts w:ascii="Times New Roman" w:eastAsia="楷体" w:hAnsi="Times New Roman" w:cs="Times New Roman" w:hint="eastAsia"/>
+          <w:b/>
           <w:color w:val="000000" w:themeColor="text1"/>
           <w:lang w:eastAsia="zh-CN"/>
         </w:rPr>
-        <w:t>12</w:t>
+        <w:t>2026.08</w:t>
       </w:r>
     </w:p>
     <w:p>
@@ -3701,57 +3766,47 @@
           <w:sz w:val="20"/>
           <w:lang w:eastAsia="zh-CN"/>
         </w:rPr>
-        <w:t>课题</w:t>
-      </w:r>
-      <w:r>
-        <w:rPr>
-          <w:rFonts w:ascii="Times New Roman" w:eastAsia="楷体" w:hAnsi="Times New Roman" w:cs="Times New Roman" w:hint="eastAsia"/>
-          <w:b/>
-          <w:bCs/>
-          <w:sz w:val="20"/>
-          <w:lang w:eastAsia="zh-CN"/>
-        </w:rPr>
-        <w:t>二</w:t>
-      </w:r>
-      <w:r>
-        <w:rPr>
-          <w:rFonts w:ascii="Times New Roman" w:eastAsia="楷体" w:hAnsi="Times New Roman" w:cs="Times New Roman" w:hint="eastAsia"/>
-          <w:b/>
-          <w:bCs/>
-          <w:sz w:val="20"/>
-          <w:lang w:eastAsia="zh-CN"/>
-        </w:rPr>
-        <w:t>：基于大生产平台的阻性存储器</w:t>
-      </w:r>
-      <w:r>
-        <w:rPr>
-          <w:rFonts w:ascii="Times New Roman" w:eastAsia="楷体" w:hAnsi="Times New Roman" w:cs="Times New Roman" w:hint="eastAsia"/>
-          <w:b/>
-          <w:bCs/>
-          <w:sz w:val="20"/>
-          <w:lang w:eastAsia="zh-CN"/>
-        </w:rPr>
-        <w:t>存算一体芯片</w:t>
-      </w:r>
-      <w:r>
-        <w:rPr>
-          <w:rFonts w:ascii="Times New Roman" w:eastAsia="楷体" w:hAnsi="Times New Roman" w:cs="Times New Roman" w:hint="eastAsia"/>
-          <w:b/>
-          <w:bCs/>
-          <w:sz w:val="20"/>
-          <w:lang w:eastAsia="zh-CN"/>
-        </w:rPr>
-        <w:t>研</w:t>
-      </w:r>
-      <w:r>
-        <w:rPr>
-          <w:rFonts w:ascii="Times New Roman" w:eastAsia="楷体" w:hAnsi="Times New Roman" w:cs="Times New Roman" w:hint="eastAsia"/>
-          <w:b/>
-          <w:bCs/>
-          <w:sz w:val="20"/>
-          <w:lang w:eastAsia="zh-CN"/>
-        </w:rPr>
-        <w:t>发</w:t>
+        <w:t>参赛</w:t>
+      </w:r>
+      <w:r>
+        <w:rPr>
+          <w:rFonts w:ascii="Times New Roman" w:eastAsia="楷体" w:hAnsi="Times New Roman" w:cs="Times New Roman" w:hint="eastAsia"/>
+          <w:b/>
+          <w:bCs/>
+          <w:sz w:val="20"/>
+          <w:lang w:eastAsia="zh-CN"/>
+        </w:rPr>
+        <w:t>成果</w:t>
+      </w:r>
+      <w:r>
+        <w:rPr>
+          <w:rFonts w:ascii="Times New Roman" w:eastAsia="楷体" w:hAnsi="Times New Roman" w:cs="Times New Roman" w:hint="eastAsia"/>
+          <w:b/>
+          <w:bCs/>
+          <w:sz w:val="20"/>
+          <w:lang w:eastAsia="zh-CN"/>
+        </w:rPr>
+        <w:t>：基于</w:t>
+      </w:r>
+      <w:r>
+        <w:rPr>
+          <w:rFonts w:ascii="Times New Roman" w:eastAsia="楷体" w:hAnsi="Times New Roman" w:cs="Times New Roman" w:hint="eastAsia"/>
+          <w:b/>
+          <w:bCs/>
+          <w:sz w:val="20"/>
+          <w:lang w:eastAsia="zh-CN"/>
+        </w:rPr>
+        <w:t>40nm PCM</w:t>
+      </w:r>
+      <w:r>
+        <w:rPr>
+          <w:rFonts w:ascii="Times New Roman" w:eastAsia="楷体" w:hAnsi="Times New Roman" w:cs="Times New Roman" w:hint="eastAsia"/>
+          <w:b/>
+          <w:bCs/>
+          <w:sz w:val="20"/>
+          <w:lang w:eastAsia="zh-CN"/>
+        </w:rPr>
+        <w:t>的数模混合存算一体芯片</w:t>
       </w:r>
     </w:p>
     <w:p>
@@ -3776,109 +3831,359 @@
       <w:r>
         <w:rPr>
           <w:rFonts w:ascii="Times New Roman" w:eastAsia="楷体" w:hAnsi="Times New Roman" w:cs="Times New Roman" w:hint="eastAsia"/>
-          <w:b/>
-          <w:bCs/>
-          <w:sz w:val="20"/>
-          <w:lang w:eastAsia="zh-CN"/>
-        </w:rPr>
-        <w:t>项目背景：</w:t>
-      </w:r>
-      <w:r>
-        <w:rPr>
-          <w:rFonts w:ascii="Times New Roman" w:eastAsia="楷体" w:hAnsi="Times New Roman" w:cs="Times New Roman" w:hint="eastAsia"/>
-          <w:sz w:val="20"/>
-          <w:lang w:eastAsia="zh-CN"/>
-        </w:rPr>
-        <w:t>为</w:t>
-      </w:r>
-      <w:r>
-        <w:rPr>
-          <w:rFonts w:ascii="Times New Roman" w:eastAsia="楷体" w:hAnsi="Times New Roman" w:cs="Times New Roman" w:hint="eastAsia"/>
-          <w:sz w:val="20"/>
-          <w:lang w:eastAsia="zh-CN"/>
-        </w:rPr>
-        <w:t>推动先进存储器件产业化与存算一体智能芯片的落地，</w:t>
-      </w:r>
-      <w:r>
-        <w:rPr>
-          <w:rFonts w:ascii="Times New Roman" w:eastAsia="楷体" w:hAnsi="Times New Roman" w:cs="Times New Roman" w:hint="eastAsia"/>
-          <w:sz w:val="20"/>
-          <w:lang w:eastAsia="zh-CN"/>
-        </w:rPr>
-        <w:t>和国内头部</w:t>
-      </w:r>
-      <w:r>
-        <w:rPr>
-          <w:rFonts w:ascii="Times New Roman" w:eastAsia="楷体" w:hAnsi="Times New Roman" w:cs="Times New Roman" w:hint="eastAsia"/>
-          <w:sz w:val="20"/>
-          <w:lang w:eastAsia="zh-CN"/>
-        </w:rPr>
-        <w:t>Fab</w:t>
-      </w:r>
-      <w:r>
-        <w:rPr>
-          <w:rFonts w:ascii="Times New Roman" w:eastAsia="楷体" w:hAnsi="Times New Roman" w:cs="Times New Roman" w:hint="eastAsia"/>
-          <w:sz w:val="20"/>
-          <w:lang w:eastAsia="zh-CN"/>
-        </w:rPr>
-        <w:t>合作</w:t>
-      </w:r>
-      <w:r>
-        <w:rPr>
-          <w:rFonts w:ascii="Times New Roman" w:eastAsia="楷体" w:hAnsi="Times New Roman" w:cs="Times New Roman" w:hint="eastAsia"/>
-          <w:sz w:val="20"/>
-          <w:lang w:eastAsia="zh-CN"/>
-        </w:rPr>
-        <w:t>，本课题组与北方集</w:t>
-      </w:r>
-      <w:r>
-        <w:rPr>
-          <w:rFonts w:ascii="Times New Roman" w:eastAsia="楷体" w:hAnsi="Times New Roman" w:cs="Times New Roman" w:hint="eastAsia"/>
-          <w:sz w:val="20"/>
-          <w:lang w:eastAsia="zh-CN"/>
-        </w:rPr>
-        <w:lastRenderedPageBreak/>
-        <w:t>成电路技术创新中心共同开发基于大生产平台的阻性存储器</w:t>
-      </w:r>
-      <w:r>
-        <w:rPr>
-          <w:rFonts w:ascii="Times New Roman" w:eastAsia="楷体" w:hAnsi="Times New Roman" w:cs="Times New Roman" w:hint="eastAsia"/>
-          <w:sz w:val="20"/>
-          <w:lang w:eastAsia="zh-CN"/>
-        </w:rPr>
-        <w:t>（</w:t>
-      </w:r>
-      <w:r>
-        <w:rPr>
-          <w:rFonts w:ascii="Times New Roman" w:eastAsia="楷体" w:hAnsi="Times New Roman" w:cs="Times New Roman" w:hint="eastAsia"/>
-          <w:sz w:val="20"/>
-          <w:lang w:eastAsia="zh-CN"/>
-        </w:rPr>
-        <w:t>RRAM</w:t>
-      </w:r>
-      <w:r>
-        <w:rPr>
-          <w:rFonts w:ascii="Times New Roman" w:eastAsia="楷体" w:hAnsi="Times New Roman" w:cs="Times New Roman" w:hint="eastAsia"/>
-          <w:sz w:val="20"/>
-          <w:lang w:eastAsia="zh-CN"/>
-        </w:rPr>
-        <w:t>）</w:t>
-      </w:r>
-      <w:r>
-        <w:rPr>
-          <w:rFonts w:ascii="Times New Roman" w:eastAsia="楷体" w:hAnsi="Times New Roman" w:cs="Times New Roman" w:hint="eastAsia"/>
-          <w:sz w:val="20"/>
-          <w:lang w:eastAsia="zh-CN"/>
-        </w:rPr>
-        <w:t>存内计算芯片</w:t>
-      </w:r>
-      <w:r>
-        <w:rPr>
-          <w:rFonts w:ascii="Times New Roman" w:eastAsia="楷体" w:hAnsi="Times New Roman" w:cs="Times New Roman" w:hint="eastAsia"/>
-          <w:sz w:val="20"/>
-          <w:lang w:eastAsia="zh-CN"/>
-        </w:rPr>
-        <w:t>研制</w:t>
+          <w:sz w:val="20"/>
+          <w:lang w:eastAsia="zh-CN"/>
+        </w:rPr>
+        <w:t>入选决赛，</w:t>
+      </w:r>
+      <w:r>
+        <w:rPr>
+          <w:rFonts w:ascii="Times New Roman" w:eastAsia="楷体" w:hAnsi="Times New Roman" w:cs="Times New Roman" w:hint="eastAsia"/>
+          <w:sz w:val="20"/>
+          <w:lang w:eastAsia="zh-CN"/>
+        </w:rPr>
+        <w:t>2026</w:t>
+      </w:r>
+      <w:r>
+        <w:rPr>
+          <w:rFonts w:ascii="Times New Roman" w:eastAsia="楷体" w:hAnsi="Times New Roman" w:cs="Times New Roman" w:hint="eastAsia"/>
+          <w:sz w:val="20"/>
+          <w:lang w:eastAsia="zh-CN"/>
+        </w:rPr>
+        <w:t>年</w:t>
+      </w:r>
+      <w:r>
+        <w:rPr>
+          <w:rFonts w:ascii="Times New Roman" w:eastAsia="楷体" w:hAnsi="Times New Roman" w:cs="Times New Roman" w:hint="eastAsia"/>
+          <w:sz w:val="20"/>
+          <w:lang w:eastAsia="zh-CN"/>
+        </w:rPr>
+        <w:t>8</w:t>
+      </w:r>
+      <w:r>
+        <w:rPr>
+          <w:rFonts w:ascii="Times New Roman" w:eastAsia="楷体" w:hAnsi="Times New Roman" w:cs="Times New Roman" w:hint="eastAsia"/>
+          <w:sz w:val="20"/>
+          <w:lang w:eastAsia="zh-CN"/>
+        </w:rPr>
+        <w:t>月在</w:t>
+      </w:r>
+      <w:r>
+        <w:rPr>
+          <w:rFonts w:ascii="Times New Roman" w:eastAsia="楷体" w:hAnsi="Times New Roman" w:cs="Times New Roman" w:hint="eastAsia"/>
+          <w:sz w:val="20"/>
+          <w:lang w:eastAsia="zh-CN"/>
+        </w:rPr>
+        <w:t>南方科技大学</w:t>
+      </w:r>
+      <w:r>
+        <w:rPr>
+          <w:rFonts w:ascii="Times New Roman" w:eastAsia="楷体" w:hAnsi="Times New Roman" w:cs="Times New Roman" w:hint="eastAsia"/>
+          <w:sz w:val="20"/>
+          <w:lang w:eastAsia="zh-CN"/>
+        </w:rPr>
+        <w:t>线下举办</w:t>
+      </w:r>
+    </w:p>
+    <w:p>
+      <w:pPr>
+        <w:rPr>
+          <w:rFonts w:hint="eastAsia"/>
+          <w:lang w:eastAsia="zh-CN"/>
+        </w:rPr>
+      </w:pPr>
+    </w:p>
+    <w:p>
+      <w:pPr>
+        <w:pStyle w:val="1"/>
+        <w:tabs>
+          <w:tab w:val="left" w:pos="11325"/>
+        </w:tabs>
+        <w:spacing w:before="100" w:after="100" w:line="300" w:lineRule="exact"/>
+        <w:ind w:left="0"/>
+        <w:rPr>
+          <w:rFonts w:ascii="Times New Roman" w:eastAsia="楷体" w:hAnsi="Times New Roman" w:cs="Times New Roman"/>
+          <w:position w:val="4"/>
+          <w:u w:val="single"/>
+          <w:lang w:eastAsia="zh-CN"/>
+        </w:rPr>
+      </w:pPr>
+      <w:r>
+        <w:rPr>
+          <w:rFonts w:ascii="Times New Roman" w:eastAsia="楷体" w:hAnsi="Times New Roman" w:cs="Times New Roman" w:hint="eastAsia"/>
+          <w:position w:val="4"/>
+          <w:sz w:val="24"/>
+          <w:szCs w:val="24"/>
+          <w:u w:val="single"/>
+          <w:lang w:eastAsia="zh-CN"/>
+        </w:rPr>
+        <w:t>项目经历</w:t>
+      </w:r>
+      <w:r>
+        <w:rPr>
+          <w:rFonts w:ascii="Times New Roman" w:eastAsia="楷体" w:hAnsi="Times New Roman" w:cs="Times New Roman"/>
+          <w:sz w:val="24"/>
+          <w:szCs w:val="24"/>
+          <w:u w:val="single"/>
+          <w:lang w:eastAsia="zh-CN"/>
+        </w:rPr>
+        <w:t xml:space="preserve">           </w:t>
+      </w:r>
+      <w:r>
+        <w:rPr>
+          <w:rFonts w:ascii="Times New Roman" w:eastAsia="楷体" w:hAnsi="Times New Roman" w:cs="Times New Roman"/>
+          <w:position w:val="4"/>
+          <w:u w:val="single"/>
+          <w:lang w:eastAsia="zh-CN"/>
+        </w:rPr>
+        <w:t xml:space="preserve">             </w:t>
+      </w:r>
+      <w:r>
+        <w:rPr>
+          <w:rFonts w:ascii="Times New Roman" w:eastAsia="楷体" w:hAnsi="Times New Roman" w:cs="Times New Roman"/>
+          <w:position w:val="4"/>
+          <w:sz w:val="20"/>
+          <w:szCs w:val="20"/>
+          <w:u w:val="single"/>
+          <w:lang w:eastAsia="zh-CN"/>
+        </w:rPr>
+        <w:t xml:space="preserve">                    </w:t>
+      </w:r>
+      <w:r>
+        <w:rPr>
+          <w:rFonts w:ascii="Times New Roman" w:eastAsia="楷体" w:hAnsi="Times New Roman" w:cs="Times New Roman"/>
+          <w:position w:val="4"/>
+          <w:u w:val="single"/>
+          <w:lang w:eastAsia="zh-CN"/>
+        </w:rPr>
+        <w:t xml:space="preserve">                                                                                                                                        </w:t>
+      </w:r>
+    </w:p>
+    <w:p>
+      <w:pPr>
+        <w:spacing w:before="100" w:after="60"/>
+        <w:ind w:firstLine="108"/>
+        <w:jc w:val="both"/>
+        <w:rPr>
+          <w:rFonts w:ascii="Times New Roman" w:eastAsia="楷体" w:hAnsi="Times New Roman" w:cs="Times New Roman"/>
+          <w:color w:val="000000" w:themeColor="text1"/>
+          <w:lang w:eastAsia="zh-CN"/>
+        </w:rPr>
+      </w:pPr>
+      <w:r>
+        <w:rPr>
+          <w:rFonts w:ascii="Times New Roman" w:eastAsia="楷体" w:hAnsi="Times New Roman" w:cs="Times New Roman"/>
+          <w:b/>
+          <w:bCs/>
+          <w:color w:val="000000" w:themeColor="text1"/>
+          <w:lang w:eastAsia="zh-CN"/>
+        </w:rPr>
+        <w:t>基于</w:t>
+      </w:r>
+      <w:r>
+        <w:rPr>
+          <w:rFonts w:ascii="Times New Roman" w:eastAsia="楷体" w:hAnsi="Times New Roman" w:cs="Times New Roman" w:hint="eastAsia"/>
+          <w:b/>
+          <w:bCs/>
+          <w:color w:val="000000" w:themeColor="text1"/>
+          <w:lang w:eastAsia="zh-CN"/>
+        </w:rPr>
+        <w:t>阻性存储器的高能效智能芯片项目</w:t>
+      </w:r>
+      <w:r>
+        <w:rPr>
+          <w:rFonts w:ascii="Times New Roman" w:eastAsia="楷体" w:hAnsi="Times New Roman" w:cs="Times New Roman" w:hint="eastAsia"/>
+          <w:b/>
+          <w:bCs/>
+          <w:color w:val="000000" w:themeColor="text1"/>
+          <w:lang w:eastAsia="zh-CN"/>
+        </w:rPr>
+        <w:t xml:space="preserve"> </w:t>
+      </w:r>
+      <w:r>
+        <w:rPr>
+          <w:rFonts w:ascii="Times New Roman" w:eastAsia="楷体" w:hAnsi="Times New Roman" w:cs="Times New Roman" w:hint="eastAsia"/>
+          <w:b/>
+          <w:bCs/>
+          <w:color w:val="000000" w:themeColor="text1"/>
+          <w:lang w:eastAsia="zh-CN"/>
+        </w:rPr>
+        <w:t>（核心项目成员）</w:t>
+      </w:r>
+      <w:r>
+        <w:rPr>
+          <w:rFonts w:ascii="Times New Roman" w:eastAsia="楷体" w:hAnsi="Times New Roman" w:cs="Times New Roman" w:hint="eastAsia"/>
+          <w:b/>
+          <w:bCs/>
+          <w:color w:val="000000" w:themeColor="text1"/>
+          <w:lang w:eastAsia="zh-CN"/>
+        </w:rPr>
+        <w:t xml:space="preserve">                            </w:t>
+      </w:r>
+      <w:r>
+        <w:rPr>
+          <w:rFonts w:ascii="Times New Roman" w:eastAsia="楷体" w:hAnsi="Times New Roman" w:cs="Times New Roman"/>
+          <w:b/>
+          <w:bCs/>
+          <w:color w:val="000000" w:themeColor="text1"/>
+          <w:lang w:eastAsia="zh-CN"/>
+        </w:rPr>
+        <w:t xml:space="preserve">                </w:t>
+      </w:r>
+      <w:r>
+        <w:rPr>
+          <w:rFonts w:ascii="Times New Roman" w:eastAsia="楷体" w:hAnsi="Times New Roman" w:cs="Times New Roman"/>
+          <w:b/>
+          <w:bCs/>
+          <w:color w:val="000000" w:themeColor="text1"/>
+          <w:lang w:eastAsia="zh-CN"/>
+        </w:rPr>
+        <w:tab/>
+      </w:r>
+      <w:r>
+        <w:rPr>
+          <w:rFonts w:ascii="Times New Roman" w:eastAsia="楷体" w:hAnsi="Times New Roman" w:cs="Times New Roman"/>
+          <w:b/>
+          <w:color w:val="000000" w:themeColor="text1"/>
+          <w:lang w:eastAsia="zh-CN"/>
+        </w:rPr>
+        <w:t>202</w:t>
+      </w:r>
+      <w:r>
+        <w:rPr>
+          <w:rFonts w:ascii="Times New Roman" w:eastAsia="楷体" w:hAnsi="Times New Roman" w:cs="Times New Roman" w:hint="eastAsia"/>
+          <w:b/>
+          <w:color w:val="000000" w:themeColor="text1"/>
+          <w:lang w:eastAsia="zh-CN"/>
+        </w:rPr>
+        <w:t>1.</w:t>
+      </w:r>
+      <w:r>
+        <w:rPr>
+          <w:rFonts w:ascii="Times New Roman" w:eastAsia="楷体" w:hAnsi="Times New Roman" w:cs="Times New Roman" w:hint="eastAsia"/>
+          <w:b/>
+          <w:color w:val="000000" w:themeColor="text1"/>
+          <w:lang w:eastAsia="zh-CN"/>
+        </w:rPr>
+        <w:t>11</w:t>
+      </w:r>
+      <w:r>
+        <w:rPr>
+          <w:rFonts w:ascii="Times New Roman" w:eastAsia="楷体" w:hAnsi="Times New Roman" w:cs="Times New Roman"/>
+          <w:b/>
+          <w:color w:val="000000" w:themeColor="text1"/>
+          <w:lang w:eastAsia="zh-CN"/>
+        </w:rPr>
+        <w:t>~202</w:t>
+      </w:r>
+      <w:r>
+        <w:rPr>
+          <w:rFonts w:ascii="Times New Roman" w:eastAsia="楷体" w:hAnsi="Times New Roman" w:cs="Times New Roman" w:hint="eastAsia"/>
+          <w:b/>
+          <w:color w:val="000000" w:themeColor="text1"/>
+          <w:lang w:eastAsia="zh-CN"/>
+        </w:rPr>
+        <w:t>4</w:t>
+      </w:r>
+      <w:r>
+        <w:rPr>
+          <w:rFonts w:ascii="Times New Roman" w:eastAsia="楷体" w:hAnsi="Times New Roman" w:cs="Times New Roman" w:hint="eastAsia"/>
+          <w:b/>
+          <w:color w:val="000000" w:themeColor="text1"/>
+          <w:lang w:eastAsia="zh-CN"/>
+        </w:rPr>
+        <w:t>.</w:t>
+      </w:r>
+      <w:r>
+        <w:rPr>
+          <w:rFonts w:ascii="Times New Roman" w:eastAsia="楷体" w:hAnsi="Times New Roman" w:cs="Times New Roman" w:hint="eastAsia"/>
+          <w:b/>
+          <w:color w:val="000000" w:themeColor="text1"/>
+          <w:lang w:eastAsia="zh-CN"/>
+        </w:rPr>
+        <w:t>12</w:t>
+      </w:r>
+    </w:p>
+    <w:p>
+      <w:pPr>
+        <w:pStyle w:val="ab"/>
+        <w:numPr>
+          <w:ilvl w:val="0"/>
+          <w:numId w:val="2"/>
+        </w:numPr>
+        <w:tabs>
+          <w:tab w:val="left" w:pos="9744"/>
+        </w:tabs>
+        <w:spacing w:before="13"/>
+        <w:ind w:left="528"/>
+        <w:jc w:val="both"/>
+        <w:rPr>
+          <w:rFonts w:ascii="Times New Roman" w:eastAsia="楷体" w:hAnsi="Times New Roman" w:cs="Times New Roman"/>
+          <w:b/>
+          <w:bCs/>
+          <w:sz w:val="20"/>
+          <w:lang w:eastAsia="zh-CN"/>
+        </w:rPr>
+      </w:pPr>
+      <w:r>
+        <w:rPr>
+          <w:rFonts w:ascii="Times New Roman" w:eastAsia="楷体" w:hAnsi="Times New Roman" w:cs="Times New Roman" w:hint="eastAsia"/>
+          <w:b/>
+          <w:bCs/>
+          <w:sz w:val="20"/>
+          <w:lang w:eastAsia="zh-CN"/>
+        </w:rPr>
+        <w:t>课题</w:t>
+      </w:r>
+      <w:r>
+        <w:rPr>
+          <w:rFonts w:ascii="Times New Roman" w:eastAsia="楷体" w:hAnsi="Times New Roman" w:cs="Times New Roman" w:hint="eastAsia"/>
+          <w:b/>
+          <w:bCs/>
+          <w:sz w:val="20"/>
+          <w:lang w:eastAsia="zh-CN"/>
+        </w:rPr>
+        <w:t>二</w:t>
+      </w:r>
+      <w:r>
+        <w:rPr>
+          <w:rFonts w:ascii="Times New Roman" w:eastAsia="楷体" w:hAnsi="Times New Roman" w:cs="Times New Roman" w:hint="eastAsia"/>
+          <w:b/>
+          <w:bCs/>
+          <w:sz w:val="20"/>
+          <w:lang w:eastAsia="zh-CN"/>
+        </w:rPr>
+        <w:t>：基于大生产平台的阻性存储器</w:t>
+      </w:r>
+      <w:r>
+        <w:rPr>
+          <w:rFonts w:ascii="Times New Roman" w:eastAsia="楷体" w:hAnsi="Times New Roman" w:cs="Times New Roman" w:hint="eastAsia"/>
+          <w:b/>
+          <w:bCs/>
+          <w:sz w:val="20"/>
+          <w:lang w:eastAsia="zh-CN"/>
+        </w:rPr>
+        <w:t>存算一体芯片</w:t>
+      </w:r>
+      <w:r>
+        <w:rPr>
+          <w:rFonts w:ascii="Times New Roman" w:eastAsia="楷体" w:hAnsi="Times New Roman" w:cs="Times New Roman" w:hint="eastAsia"/>
+          <w:b/>
+          <w:bCs/>
+          <w:sz w:val="20"/>
+          <w:lang w:eastAsia="zh-CN"/>
+        </w:rPr>
+        <w:t>研</w:t>
+      </w:r>
+      <w:r>
+        <w:rPr>
+          <w:rFonts w:ascii="Times New Roman" w:eastAsia="楷体" w:hAnsi="Times New Roman" w:cs="Times New Roman" w:hint="eastAsia"/>
+          <w:b/>
+          <w:bCs/>
+          <w:sz w:val="20"/>
+          <w:lang w:eastAsia="zh-CN"/>
+        </w:rPr>
+        <w:t>发</w:t>
       </w:r>
     </w:p>
     <w:p>
@@ -3908,6 +4213,124 @@
           <w:sz w:val="20"/>
           <w:lang w:eastAsia="zh-CN"/>
         </w:rPr>
+        <w:t>项目背景：</w:t>
+      </w:r>
+      <w:r>
+        <w:rPr>
+          <w:rFonts w:ascii="Times New Roman" w:eastAsia="楷体" w:hAnsi="Times New Roman" w:cs="Times New Roman" w:hint="eastAsia"/>
+          <w:sz w:val="20"/>
+          <w:lang w:eastAsia="zh-CN"/>
+        </w:rPr>
+        <w:t>为</w:t>
+      </w:r>
+      <w:r>
+        <w:rPr>
+          <w:rFonts w:ascii="Times New Roman" w:eastAsia="楷体" w:hAnsi="Times New Roman" w:cs="Times New Roman" w:hint="eastAsia"/>
+          <w:sz w:val="20"/>
+          <w:lang w:eastAsia="zh-CN"/>
+        </w:rPr>
+        <w:t>推动先进存储器件产业化与存算一体智能芯片的落地，</w:t>
+      </w:r>
+      <w:r>
+        <w:rPr>
+          <w:rFonts w:ascii="Times New Roman" w:eastAsia="楷体" w:hAnsi="Times New Roman" w:cs="Times New Roman" w:hint="eastAsia"/>
+          <w:sz w:val="20"/>
+          <w:lang w:eastAsia="zh-CN"/>
+        </w:rPr>
+        <w:t>和国内头部</w:t>
+      </w:r>
+      <w:r>
+        <w:rPr>
+          <w:rFonts w:ascii="Times New Roman" w:eastAsia="楷体" w:hAnsi="Times New Roman" w:cs="Times New Roman" w:hint="eastAsia"/>
+          <w:sz w:val="20"/>
+          <w:lang w:eastAsia="zh-CN"/>
+        </w:rPr>
+        <w:t>Fab</w:t>
+      </w:r>
+      <w:r>
+        <w:rPr>
+          <w:rFonts w:ascii="Times New Roman" w:eastAsia="楷体" w:hAnsi="Times New Roman" w:cs="Times New Roman" w:hint="eastAsia"/>
+          <w:sz w:val="20"/>
+          <w:lang w:eastAsia="zh-CN"/>
+        </w:rPr>
+        <w:t>合作</w:t>
+      </w:r>
+      <w:r>
+        <w:rPr>
+          <w:rFonts w:ascii="Times New Roman" w:eastAsia="楷体" w:hAnsi="Times New Roman" w:cs="Times New Roman" w:hint="eastAsia"/>
+          <w:sz w:val="20"/>
+          <w:lang w:eastAsia="zh-CN"/>
+        </w:rPr>
+        <w:t>，本课题组与北方集成电路技术创新中心共同开发基于大生产平台的阻性存储器</w:t>
+      </w:r>
+      <w:r>
+        <w:rPr>
+          <w:rFonts w:ascii="Times New Roman" w:eastAsia="楷体" w:hAnsi="Times New Roman" w:cs="Times New Roman" w:hint="eastAsia"/>
+          <w:sz w:val="20"/>
+          <w:lang w:eastAsia="zh-CN"/>
+        </w:rPr>
+        <w:t>（</w:t>
+      </w:r>
+      <w:r>
+        <w:rPr>
+          <w:rFonts w:ascii="Times New Roman" w:eastAsia="楷体" w:hAnsi="Times New Roman" w:cs="Times New Roman" w:hint="eastAsia"/>
+          <w:sz w:val="20"/>
+          <w:lang w:eastAsia="zh-CN"/>
+        </w:rPr>
+        <w:t>RRAM</w:t>
+      </w:r>
+      <w:r>
+        <w:rPr>
+          <w:rFonts w:ascii="Times New Roman" w:eastAsia="楷体" w:hAnsi="Times New Roman" w:cs="Times New Roman" w:hint="eastAsia"/>
+          <w:sz w:val="20"/>
+          <w:lang w:eastAsia="zh-CN"/>
+        </w:rPr>
+        <w:t>）</w:t>
+      </w:r>
+      <w:r>
+        <w:rPr>
+          <w:rFonts w:ascii="Times New Roman" w:eastAsia="楷体" w:hAnsi="Times New Roman" w:cs="Times New Roman" w:hint="eastAsia"/>
+          <w:sz w:val="20"/>
+          <w:lang w:eastAsia="zh-CN"/>
+        </w:rPr>
+        <w:t>存内计算芯片</w:t>
+      </w:r>
+      <w:r>
+        <w:rPr>
+          <w:rFonts w:ascii="Times New Roman" w:eastAsia="楷体" w:hAnsi="Times New Roman" w:cs="Times New Roman" w:hint="eastAsia"/>
+          <w:sz w:val="20"/>
+          <w:lang w:eastAsia="zh-CN"/>
+        </w:rPr>
+        <w:t>研制</w:t>
+      </w:r>
+    </w:p>
+    <w:p>
+      <w:pPr>
+        <w:pStyle w:val="ab"/>
+        <w:numPr>
+          <w:ilvl w:val="0"/>
+          <w:numId w:val="2"/>
+        </w:numPr>
+        <w:tabs>
+          <w:tab w:val="left" w:pos="9744"/>
+        </w:tabs>
+        <w:spacing w:before="13"/>
+        <w:ind w:left="851"/>
+        <w:jc w:val="both"/>
+        <w:rPr>
+          <w:rFonts w:ascii="Times New Roman" w:eastAsia="楷体" w:hAnsi="Times New Roman" w:cs="Times New Roman"/>
+          <w:sz w:val="20"/>
+          <w:lang w:eastAsia="zh-CN"/>
+        </w:rPr>
+      </w:pPr>
+      <w:r>
+        <w:rPr>
+          <w:rFonts w:ascii="Times New Roman" w:eastAsia="楷体" w:hAnsi="Times New Roman" w:cs="Times New Roman" w:hint="eastAsia"/>
+          <w:b/>
+          <w:bCs/>
+          <w:sz w:val="20"/>
+          <w:lang w:eastAsia="zh-CN"/>
+        </w:rPr>
         <w:t>项目成果：</w:t>
       </w:r>
       <w:r>
@@ -4254,6 +4677,64 @@
           <w:lang w:eastAsia="zh-CN"/>
         </w:rPr>
         <w:t>orch, TensorFlow</w:t>
+      </w:r>
+    </w:p>
+    <w:p>
+      <w:pPr>
+        <w:numPr>
+          <w:ilvl w:val="0"/>
+          <w:numId w:val="2"/>
+        </w:numPr>
+        <w:tabs>
+          <w:tab w:val="left" w:pos="9744"/>
+        </w:tabs>
+        <w:spacing w:before="13" w:line="264" w:lineRule="auto"/>
+        <w:ind w:left="567"/>
+        <w:rPr>
+          <w:rFonts w:ascii="Times New Roman" w:eastAsia="楷体" w:hAnsi="Times New Roman" w:cs="Times New Roman"/>
+          <w:sz w:val="20"/>
+          <w:lang w:eastAsia="zh-CN"/>
+        </w:rPr>
+      </w:pPr>
+      <w:r>
+        <w:rPr>
+          <w:rFonts w:ascii="Times New Roman" w:eastAsia="楷体" w:hAnsi="Times New Roman" w:cs="Times New Roman" w:hint="eastAsia"/>
+          <w:sz w:val="20"/>
+          <w:lang w:eastAsia="zh-CN"/>
+        </w:rPr>
+        <w:t>Coding Agent</w:t>
+      </w:r>
+      <w:r>
+        <w:rPr>
+          <w:rFonts w:ascii="Times New Roman" w:eastAsia="楷体" w:hAnsi="Times New Roman" w:cs="Times New Roman" w:hint="eastAsia"/>
+          <w:sz w:val="20"/>
+          <w:lang w:eastAsia="zh-CN"/>
+        </w:rPr>
+        <w:t>：</w:t>
+      </w:r>
+      <w:r>
+        <w:rPr>
+          <w:rFonts w:ascii="Times New Roman" w:eastAsia="楷体" w:hAnsi="Times New Roman" w:cs="Times New Roman" w:hint="eastAsia"/>
+          <w:sz w:val="20"/>
+          <w:lang w:eastAsia="zh-CN"/>
+        </w:rPr>
+        <w:t>Codex</w:t>
+      </w:r>
+      <w:r>
+        <w:rPr>
+          <w:rFonts w:ascii="Times New Roman" w:eastAsia="楷体" w:hAnsi="Times New Roman" w:cs="Times New Roman" w:hint="eastAsia"/>
+          <w:sz w:val="20"/>
+          <w:lang w:eastAsia="zh-CN"/>
+        </w:rPr>
+        <w:t>，</w:t>
+      </w:r>
+      <w:r>
+        <w:rPr>
+          <w:rFonts w:ascii="Times New Roman" w:eastAsia="楷体" w:hAnsi="Times New Roman" w:cs="Times New Roman" w:hint="eastAsia"/>
+          <w:sz w:val="20"/>
+          <w:lang w:eastAsia="zh-CN"/>
+        </w:rPr>
+        <w:t>Claude Code</w:t>
       </w:r>
     </w:p>
     <w:p>
@@ -4564,15 +5045,7 @@
           <w:sz w:val="20"/>
           <w:lang w:eastAsia="zh-CN"/>
         </w:rPr>
-        <w:t>“</w:t>
-      </w:r>
-      <w:r>
-        <w:rPr>
-          <w:rFonts w:ascii="Times New Roman" w:eastAsia="楷体" w:hAnsi="Times New Roman" w:cs="Times New Roman"/>
-          <w:sz w:val="20"/>
-          <w:lang w:eastAsia="zh-CN"/>
-        </w:rPr>
-        <w:t>PiMM-NoC: Process-in-Memristor-Memory NoC with RL Mapping Framework for Versatile AI Models</w:t>
+        <w:t>“PiMM-NoC: Process-in-Memristor-Memory NoC with RL Mapping Framework for Versatile AI Models</w:t>
       </w:r>
       <w:r>
         <w:rPr>
@@ -4821,6 +5294,398 @@
         </w:numPr>
         <w:rPr>
           <w:rFonts w:ascii="Times New Roman" w:eastAsia="楷体" w:hAnsi="Times New Roman" w:cs="Times New Roman"/>
+          <w:sz w:val="20"/>
+          <w:lang w:eastAsia="zh-CN"/>
+        </w:rPr>
+      </w:pPr>
+      <w:r>
+        <w:rPr>
+          <w:rFonts w:ascii="Times New Roman" w:eastAsia="楷体" w:hAnsi="Times New Roman" w:cs="Times New Roman"/>
+          <w:sz w:val="20"/>
+          <w:lang w:eastAsia="zh-CN"/>
+        </w:rPr>
+        <w:t>L</w:t>
+      </w:r>
+      <w:r>
+        <w:rPr>
+          <w:rFonts w:ascii="Times New Roman" w:eastAsia="楷体" w:hAnsi="Times New Roman" w:cs="Times New Roman" w:hint="eastAsia"/>
+          <w:sz w:val="20"/>
+          <w:lang w:eastAsia="zh-CN"/>
+        </w:rPr>
+        <w:t>.</w:t>
+      </w:r>
+      <w:r>
+        <w:rPr>
+          <w:rFonts w:ascii="Times New Roman" w:eastAsia="楷体" w:hAnsi="Times New Roman" w:cs="Times New Roman"/>
+          <w:sz w:val="20"/>
+          <w:lang w:eastAsia="zh-CN"/>
+        </w:rPr>
+        <w:t xml:space="preserve"> Cai#, Y</w:t>
+      </w:r>
+      <w:r>
+        <w:rPr>
+          <w:rFonts w:ascii="Times New Roman" w:eastAsia="楷体" w:hAnsi="Times New Roman" w:cs="Times New Roman" w:hint="eastAsia"/>
+          <w:sz w:val="20"/>
+          <w:lang w:eastAsia="zh-CN"/>
+        </w:rPr>
+        <w:t>.</w:t>
+      </w:r>
+      <w:r>
+        <w:rPr>
+          <w:rFonts w:ascii="Times New Roman" w:eastAsia="楷体" w:hAnsi="Times New Roman" w:cs="Times New Roman"/>
+          <w:sz w:val="20"/>
+          <w:lang w:eastAsia="zh-CN"/>
+        </w:rPr>
+        <w:t xml:space="preserve"> Tao^#, C</w:t>
+      </w:r>
+      <w:r>
+        <w:rPr>
+          <w:rFonts w:ascii="Times New Roman" w:eastAsia="楷体" w:hAnsi="Times New Roman" w:cs="Times New Roman" w:hint="eastAsia"/>
+          <w:sz w:val="20"/>
+          <w:lang w:eastAsia="zh-CN"/>
+        </w:rPr>
+        <w:t>.</w:t>
+      </w:r>
+      <w:r>
+        <w:rPr>
+          <w:rFonts w:ascii="Times New Roman" w:eastAsia="楷体" w:hAnsi="Times New Roman" w:cs="Times New Roman"/>
+          <w:sz w:val="20"/>
+          <w:lang w:eastAsia="zh-CN"/>
+        </w:rPr>
+        <w:t xml:space="preserve"> Xie#, L</w:t>
+      </w:r>
+      <w:r>
+        <w:rPr>
+          <w:rFonts w:ascii="Times New Roman" w:eastAsia="楷体" w:hAnsi="Times New Roman" w:cs="Times New Roman" w:hint="eastAsia"/>
+          <w:sz w:val="20"/>
+          <w:lang w:eastAsia="zh-CN"/>
+        </w:rPr>
+        <w:t>.</w:t>
+      </w:r>
+      <w:r>
+        <w:rPr>
+          <w:rFonts w:ascii="Times New Roman" w:eastAsia="楷体" w:hAnsi="Times New Roman" w:cs="Times New Roman"/>
+          <w:sz w:val="20"/>
+          <w:lang w:eastAsia="zh-CN"/>
+        </w:rPr>
+        <w:t xml:space="preserve"> Yan#, S</w:t>
+      </w:r>
+      <w:r>
+        <w:rPr>
+          <w:rFonts w:ascii="Times New Roman" w:eastAsia="楷体" w:hAnsi="Times New Roman" w:cs="Times New Roman" w:hint="eastAsia"/>
+          <w:sz w:val="20"/>
+          <w:lang w:eastAsia="zh-CN"/>
+        </w:rPr>
+        <w:t>.</w:t>
+      </w:r>
+      <w:r>
+        <w:rPr>
+          <w:rFonts w:ascii="Times New Roman" w:eastAsia="楷体" w:hAnsi="Times New Roman" w:cs="Times New Roman"/>
+          <w:sz w:val="20"/>
+          <w:lang w:eastAsia="zh-CN"/>
+        </w:rPr>
+        <w:t xml:space="preserve"> Li, R</w:t>
+      </w:r>
+      <w:r>
+        <w:rPr>
+          <w:rFonts w:ascii="Times New Roman" w:eastAsia="楷体" w:hAnsi="Times New Roman" w:cs="Times New Roman" w:hint="eastAsia"/>
+          <w:sz w:val="20"/>
+          <w:lang w:eastAsia="zh-CN"/>
+        </w:rPr>
+        <w:t>.</w:t>
+      </w:r>
+      <w:r>
+        <w:rPr>
+          <w:rFonts w:ascii="Times New Roman" w:eastAsia="楷体" w:hAnsi="Times New Roman" w:cs="Times New Roman"/>
+          <w:sz w:val="20"/>
+          <w:lang w:eastAsia="zh-CN"/>
+        </w:rPr>
+        <w:t xml:space="preserve"> Shen, </w:t>
+      </w:r>
+      <w:r>
+        <w:rPr>
+          <w:rFonts w:ascii="Times New Roman" w:eastAsia="楷体" w:hAnsi="Times New Roman" w:cs="Times New Roman"/>
+          <w:b/>
+          <w:bCs/>
+          <w:sz w:val="20"/>
+          <w:lang w:eastAsia="zh-CN"/>
+        </w:rPr>
+        <w:t>Z</w:t>
+      </w:r>
+      <w:r>
+        <w:rPr>
+          <w:rFonts w:ascii="Times New Roman" w:eastAsia="楷体" w:hAnsi="Times New Roman" w:cs="Times New Roman" w:hint="eastAsia"/>
+          <w:b/>
+          <w:bCs/>
+          <w:sz w:val="20"/>
+          <w:lang w:eastAsia="zh-CN"/>
+        </w:rPr>
+        <w:t>.</w:t>
+      </w:r>
+      <w:r>
+        <w:rPr>
+          <w:rFonts w:ascii="Times New Roman" w:eastAsia="楷体" w:hAnsi="Times New Roman" w:cs="Times New Roman"/>
+          <w:b/>
+          <w:bCs/>
+          <w:sz w:val="20"/>
+          <w:lang w:eastAsia="zh-CN"/>
+        </w:rPr>
+        <w:t xml:space="preserve"> Pan</w:t>
+      </w:r>
+      <w:r>
+        <w:rPr>
+          <w:rFonts w:ascii="Times New Roman" w:eastAsia="楷体" w:hAnsi="Times New Roman" w:cs="Times New Roman"/>
+          <w:sz w:val="20"/>
+          <w:lang w:eastAsia="zh-CN"/>
+        </w:rPr>
+        <w:t>, X</w:t>
+      </w:r>
+      <w:r>
+        <w:rPr>
+          <w:rFonts w:ascii="Times New Roman" w:eastAsia="楷体" w:hAnsi="Times New Roman" w:cs="Times New Roman" w:hint="eastAsia"/>
+          <w:sz w:val="20"/>
+          <w:lang w:eastAsia="zh-CN"/>
+        </w:rPr>
+        <w:t>.</w:t>
+      </w:r>
+      <w:r>
+        <w:rPr>
+          <w:rFonts w:ascii="Times New Roman" w:eastAsia="楷体" w:hAnsi="Times New Roman" w:cs="Times New Roman"/>
+          <w:sz w:val="20"/>
+          <w:lang w:eastAsia="zh-CN"/>
+        </w:rPr>
+        <w:t xml:space="preserve"> Wang, B</w:t>
+      </w:r>
+      <w:r>
+        <w:rPr>
+          <w:rFonts w:ascii="Times New Roman" w:eastAsia="楷体" w:hAnsi="Times New Roman" w:cs="Times New Roman" w:hint="eastAsia"/>
+          <w:sz w:val="20"/>
+          <w:lang w:eastAsia="zh-CN"/>
+        </w:rPr>
+        <w:t>.</w:t>
+      </w:r>
+      <w:r>
+        <w:rPr>
+          <w:rFonts w:ascii="Times New Roman" w:eastAsia="楷体" w:hAnsi="Times New Roman" w:cs="Times New Roman"/>
+          <w:sz w:val="20"/>
+          <w:lang w:eastAsia="zh-CN"/>
+        </w:rPr>
+        <w:t xml:space="preserve"> Wang, D</w:t>
+      </w:r>
+      <w:r>
+        <w:rPr>
+          <w:rFonts w:ascii="Times New Roman" w:eastAsia="楷体" w:hAnsi="Times New Roman" w:cs="Times New Roman" w:hint="eastAsia"/>
+          <w:sz w:val="20"/>
+          <w:lang w:eastAsia="zh-CN"/>
+        </w:rPr>
+        <w:t>.</w:t>
+      </w:r>
+      <w:r>
+        <w:rPr>
+          <w:rFonts w:ascii="Times New Roman" w:eastAsia="楷体" w:hAnsi="Times New Roman" w:cs="Times New Roman"/>
+          <w:sz w:val="20"/>
+          <w:lang w:eastAsia="zh-CN"/>
+        </w:rPr>
+        <w:t xml:space="preserve"> Shi, Y</w:t>
+      </w:r>
+      <w:r>
+        <w:rPr>
+          <w:rFonts w:ascii="Times New Roman" w:eastAsia="楷体" w:hAnsi="Times New Roman" w:cs="Times New Roman" w:hint="eastAsia"/>
+          <w:sz w:val="20"/>
+          <w:lang w:eastAsia="zh-CN"/>
+        </w:rPr>
+        <w:t>.</w:t>
+      </w:r>
+      <w:r>
+        <w:rPr>
+          <w:rFonts w:ascii="Times New Roman" w:eastAsia="楷体" w:hAnsi="Times New Roman" w:cs="Times New Roman"/>
+          <w:sz w:val="20"/>
+          <w:lang w:eastAsia="zh-CN"/>
+        </w:rPr>
+        <w:t xml:space="preserve"> Zhu, T</w:t>
+      </w:r>
+      <w:r>
+        <w:rPr>
+          <w:rFonts w:ascii="Times New Roman" w:eastAsia="楷体" w:hAnsi="Times New Roman" w:cs="Times New Roman" w:hint="eastAsia"/>
+          <w:sz w:val="20"/>
+          <w:lang w:eastAsia="zh-CN"/>
+        </w:rPr>
+        <w:t>.</w:t>
+      </w:r>
+      <w:r>
+        <w:rPr>
+          <w:rFonts w:ascii="Times New Roman" w:eastAsia="楷体" w:hAnsi="Times New Roman" w:cs="Times New Roman"/>
+          <w:sz w:val="20"/>
+          <w:lang w:eastAsia="zh-CN"/>
+        </w:rPr>
+        <w:t xml:space="preserve"> Zhang, Y</w:t>
+      </w:r>
+      <w:r>
+        <w:rPr>
+          <w:rFonts w:ascii="Times New Roman" w:eastAsia="楷体" w:hAnsi="Times New Roman" w:cs="Times New Roman" w:hint="eastAsia"/>
+          <w:sz w:val="20"/>
+          <w:lang w:eastAsia="zh-CN"/>
+        </w:rPr>
+        <w:t>.</w:t>
+      </w:r>
+      <w:r>
+        <w:rPr>
+          <w:rFonts w:ascii="Times New Roman" w:eastAsia="楷体" w:hAnsi="Times New Roman" w:cs="Times New Roman"/>
+          <w:sz w:val="20"/>
+          <w:lang w:eastAsia="zh-CN"/>
+        </w:rPr>
+        <w:t xml:space="preserve"> Zhu^, X</w:t>
+      </w:r>
+      <w:r>
+        <w:rPr>
+          <w:rFonts w:ascii="Times New Roman" w:eastAsia="楷体" w:hAnsi="Times New Roman" w:cs="Times New Roman" w:hint="eastAsia"/>
+          <w:sz w:val="20"/>
+          <w:lang w:eastAsia="zh-CN"/>
+        </w:rPr>
+        <w:t>.</w:t>
+      </w:r>
+      <w:r>
+        <w:rPr>
+          <w:rFonts w:ascii="Times New Roman" w:eastAsia="楷体" w:hAnsi="Times New Roman" w:cs="Times New Roman"/>
+          <w:sz w:val="20"/>
+          <w:lang w:eastAsia="zh-CN"/>
+        </w:rPr>
+        <w:t xml:space="preserve"> Li, Z</w:t>
+      </w:r>
+      <w:r>
+        <w:rPr>
+          <w:rFonts w:ascii="Times New Roman" w:eastAsia="楷体" w:hAnsi="Times New Roman" w:cs="Times New Roman" w:hint="eastAsia"/>
+          <w:sz w:val="20"/>
+          <w:lang w:eastAsia="zh-CN"/>
+        </w:rPr>
+        <w:t>.</w:t>
+      </w:r>
+      <w:r>
+        <w:rPr>
+          <w:rFonts w:ascii="Times New Roman" w:eastAsia="楷体" w:hAnsi="Times New Roman" w:cs="Times New Roman"/>
+          <w:sz w:val="20"/>
+          <w:lang w:eastAsia="zh-CN"/>
+        </w:rPr>
+        <w:t xml:space="preserve"> Song^, R</w:t>
+      </w:r>
+      <w:r>
+        <w:rPr>
+          <w:rFonts w:ascii="Times New Roman" w:eastAsia="楷体" w:hAnsi="Times New Roman" w:cs="Times New Roman" w:hint="eastAsia"/>
+          <w:sz w:val="20"/>
+          <w:lang w:eastAsia="zh-CN"/>
+        </w:rPr>
+        <w:t>.</w:t>
+      </w:r>
+      <w:r>
+        <w:rPr>
+          <w:rFonts w:ascii="Times New Roman" w:eastAsia="楷体" w:hAnsi="Times New Roman" w:cs="Times New Roman"/>
+          <w:sz w:val="20"/>
+          <w:lang w:eastAsia="zh-CN"/>
+        </w:rPr>
+        <w:t xml:space="preserve"> Huang, and Y</w:t>
+      </w:r>
+      <w:r>
+        <w:rPr>
+          <w:rFonts w:ascii="Times New Roman" w:eastAsia="楷体" w:hAnsi="Times New Roman" w:cs="Times New Roman" w:hint="eastAsia"/>
+          <w:sz w:val="20"/>
+          <w:lang w:eastAsia="zh-CN"/>
+        </w:rPr>
+        <w:t>.</w:t>
+      </w:r>
+      <w:r>
+        <w:rPr>
+          <w:rFonts w:ascii="Times New Roman" w:eastAsia="楷体" w:hAnsi="Times New Roman" w:cs="Times New Roman"/>
+          <w:sz w:val="20"/>
+          <w:lang w:eastAsia="zh-CN"/>
+        </w:rPr>
+        <w:t xml:space="preserve"> Yang^.</w:t>
+      </w:r>
+      <w:r>
+        <w:rPr>
+          <w:rFonts w:ascii="Times New Roman" w:eastAsia="楷体" w:hAnsi="Times New Roman" w:cs="Times New Roman" w:hint="eastAsia"/>
+          <w:sz w:val="20"/>
+          <w:lang w:eastAsia="zh-CN"/>
+        </w:rPr>
+        <w:t xml:space="preserve"> </w:t>
+      </w:r>
+      <w:r>
+        <w:rPr>
+          <w:rFonts w:ascii="Times New Roman" w:eastAsia="楷体" w:hAnsi="Times New Roman" w:cs="Times New Roman"/>
+          <w:sz w:val="20"/>
+          <w:lang w:eastAsia="zh-CN"/>
+        </w:rPr>
+        <w:t>“</w:t>
+      </w:r>
+      <w:r>
+        <w:rPr>
+          <w:rFonts w:ascii="Times New Roman" w:eastAsia="楷体" w:hAnsi="Times New Roman" w:cs="Times New Roman"/>
+          <w:sz w:val="20"/>
+          <w:lang w:eastAsia="zh-CN"/>
+        </w:rPr>
+        <w:t>A sub–10-millisecond neural dynamical system based on phase-change memristors.</w:t>
+      </w:r>
+      <w:r>
+        <w:rPr>
+          <w:rFonts w:ascii="Times New Roman" w:eastAsia="楷体" w:hAnsi="Times New Roman" w:cs="Times New Roman"/>
+          <w:sz w:val="20"/>
+          <w:lang w:eastAsia="zh-CN"/>
+        </w:rPr>
+        <w:t>”</w:t>
+      </w:r>
+      <w:r>
+        <w:rPr>
+          <w:rFonts w:ascii="Times New Roman" w:eastAsia="楷体" w:hAnsi="Times New Roman" w:cs="Times New Roman"/>
+          <w:sz w:val="20"/>
+          <w:lang w:eastAsia="zh-CN"/>
+        </w:rPr>
+        <w:t> </w:t>
+      </w:r>
+      <w:r>
+        <w:rPr>
+          <w:rFonts w:ascii="Times New Roman" w:eastAsia="楷体" w:hAnsi="Times New Roman" w:cs="Times New Roman"/>
+          <w:i/>
+          <w:iCs/>
+          <w:sz w:val="20"/>
+          <w:lang w:eastAsia="zh-CN"/>
+        </w:rPr>
+        <w:t>Science</w:t>
+      </w:r>
+      <w:r>
+        <w:rPr>
+          <w:rFonts w:ascii="Times New Roman" w:eastAsia="楷体" w:hAnsi="Times New Roman" w:cs="Times New Roman"/>
+          <w:sz w:val="20"/>
+          <w:lang w:eastAsia="zh-CN"/>
+        </w:rPr>
+        <w:t>, </w:t>
+      </w:r>
+      <w:r>
+        <w:rPr>
+          <w:rFonts w:ascii="Times New Roman" w:eastAsia="楷体" w:hAnsi="Times New Roman" w:cs="Times New Roman"/>
+          <w:i/>
+          <w:iCs/>
+          <w:sz w:val="20"/>
+          <w:lang w:eastAsia="zh-CN"/>
+        </w:rPr>
+        <w:t>393</w:t>
+      </w:r>
+      <w:r>
+        <w:rPr>
+          <w:rFonts w:ascii="Times New Roman" w:eastAsia="楷体" w:hAnsi="Times New Roman" w:cs="Times New Roman"/>
+          <w:sz w:val="20"/>
+          <w:lang w:eastAsia="zh-CN"/>
+        </w:rPr>
+        <w:t>(6806), 105-112.</w:t>
+      </w:r>
+    </w:p>
+    <w:p>
+      <w:pPr>
+        <w:pStyle w:val="ab"/>
+        <w:numPr>
+          <w:ilvl w:val="0"/>
+          <w:numId w:val="2"/>
+        </w:numPr>
+        <w:rPr>
+          <w:rFonts w:ascii="Times New Roman" w:eastAsia="楷体" w:hAnsi="Times New Roman" w:cs="Times New Roman"/>
           <w:b/>
           <w:bCs/>
           <w:sz w:val="20"/>
@@ -6278,7 +7143,7 @@
         <w:ind w:left="528"/>
         <w:jc w:val="both"/>
         <w:rPr>
-          <w:rFonts w:ascii="Times New Roman" w:eastAsia="楷体" w:hAnsi="Times New Roman" w:cs="Times New Roman" w:hint="eastAsia"/>
+          <w:rFonts w:ascii="Times New Roman" w:eastAsia="楷体" w:hAnsi="Times New Roman" w:cs="Times New Roman"/>
           <w:b/>
           <w:sz w:val="20"/>
           <w:lang w:eastAsia="zh-CN"/>
@@ -8470,7 +9335,7 @@
   <w:style w:type="paragraph" w:default="1" w:styleId="a0">
     <w:name w:val="Normal"/>
     <w:qFormat/>
-    <w:rsid w:val="00633D5C"/>
+    <w:rsid w:val="003001B5"/>
     <w:pPr>
       <w:widowControl w:val="0"/>
       <w:autoSpaceDE w:val="0"/>
@@ -8500,6 +9365,30 @@
       <w:bCs/>
       <w:sz w:val="21"/>
       <w:szCs w:val="21"/>
+    </w:rPr>
+  </w:style>
+  <w:style w:type="paragraph" w:styleId="2">
+    <w:name w:val="heading 2"/>
+    <w:basedOn w:val="a0"/>
+    <w:next w:val="a0"/>
+    <w:link w:val="20"/>
+    <w:uiPriority w:val="9"/>
+    <w:semiHidden/>
+    <w:unhideWhenUsed/>
+    <w:qFormat/>
+    <w:rsid w:val="00B546F5"/>
+    <w:pPr>
+      <w:keepNext/>
+      <w:keepLines/>
+      <w:spacing w:before="260" w:after="260" w:line="416" w:lineRule="auto"/>
+      <w:outlineLvl w:val="1"/>
+    </w:pPr>
+    <w:rPr>
+      <w:rFonts w:asciiTheme="majorHAnsi" w:eastAsiaTheme="majorEastAsia" w:hAnsiTheme="majorHAnsi" w:cstheme="majorBidi"/>
+      <w:b/>
+      <w:bCs/>
+      <w:sz w:val="32"/>
+      <w:szCs w:val="32"/>
     </w:rPr>
   </w:style>
   <w:style w:type="paragraph" w:styleId="3">
@@ -8796,6 +9685,22 @@
       <w:contextualSpacing/>
     </w:pPr>
   </w:style>
+  <w:style w:type="character" w:customStyle="1" w:styleId="20">
+    <w:name w:val="标题 2 字符"/>
+    <w:basedOn w:val="a1"/>
+    <w:link w:val="2"/>
+    <w:uiPriority w:val="9"/>
+    <w:semiHidden/>
+    <w:rsid w:val="00B546F5"/>
+    <w:rPr>
+      <w:rFonts w:asciiTheme="majorHAnsi" w:eastAsiaTheme="majorEastAsia" w:hAnsiTheme="majorHAnsi" w:cstheme="majorBidi"/>
+      <w:b/>
+      <w:bCs/>
+      <w:sz w:val="32"/>
+      <w:szCs w:val="32"/>
+      <w:lang w:eastAsia="en-US"/>
+    </w:rPr>
+  </w:style>
 </w:styles>
 </file>
 
@@ -9083,6 +9988,10 @@
 </file>
 
 <file path=customXml/item1.xml><?xml version="1.0" encoding="utf-8"?>
+<b:Sources xmlns:b="http://schemas.openxmlformats.org/officeDocument/2006/bibliography" xmlns="http://schemas.openxmlformats.org/officeDocument/2006/bibliography" SelectedStyle="\APASixthEditionOfficeOnline.xsl" StyleName="APA" Version="6"/>
+</file>
+
+<file path=customXml/item2.xml><?xml version="1.0" encoding="utf-8"?>
 <s:customData xmlns="http://www.wps.cn/officeDocument/2013/wpsCustomData" xmlns:s="http://www.wps.cn/officeDocument/2013/wpsCustomData">
   <customSectProps>
     <customSectPr/>
@@ -9093,22 +10002,18 @@
 </s:customData>
 </file>
 
-<file path=customXml/item2.xml><?xml version="1.0" encoding="utf-8"?>
-<b:Sources xmlns:b="http://schemas.openxmlformats.org/officeDocument/2006/bibliography" xmlns="http://schemas.openxmlformats.org/officeDocument/2006/bibliography" SelectedStyle="\APASixthEditionOfficeOnline.xsl" StyleName="APA" Version="6"/>
+<file path=customXml/itemProps1.xml><?xml version="1.0" encoding="utf-8"?>
+<ds:datastoreItem xmlns:ds="http://schemas.openxmlformats.org/officeDocument/2006/customXml" ds:itemID="{10B19245-CE2B-4539-9B57-F7F28CAAE5F6}">
+  <ds:schemaRefs>
+    <ds:schemaRef ds:uri="http://schemas.openxmlformats.org/officeDocument/2006/bibliography"/>
+  </ds:schemaRefs>
+</ds:datastoreItem>
 </file>
 
-<file path=customXml/itemProps1.xml><?xml version="1.0" encoding="utf-8"?>
+<file path=customXml/itemProps2.xml><?xml version="1.0" encoding="utf-8"?>
 <ds:datastoreItem xmlns:ds="http://schemas.openxmlformats.org/officeDocument/2006/customXml" ds:itemID="{B1977F7D-205B-4081-913C-38D41E755F92}">
   <ds:schemaRefs>
     <ds:schemaRef ds:uri="http://www.wps.cn/officeDocument/2013/wpsCustomData"/>
   </ds:schemaRefs>
 </ds:datastoreItem>
-</file>
-
-<file path=customXml/itemProps2.xml><?xml version="1.0" encoding="utf-8"?>
-<ds:datastoreItem xmlns:ds="http://schemas.openxmlformats.org/officeDocument/2006/customXml" ds:itemID="{10B19245-CE2B-4539-9B57-F7F28CAAE5F6}">
-  <ds:schemaRefs>
-    <ds:schemaRef ds:uri="http://schemas.openxmlformats.org/officeDocument/2006/bibliography"/>
-  </ds:schemaRefs>
-</ds:datastoreItem>
 </file>
</xml_diff>